<commit_message>
feat: build IT admin user management and enhance document workflow UX
</commit_message>
<xml_diff>
--- a/backend_iso/templates/template_wi.docx
+++ b/backend_iso/templates/template_wi.docx
@@ -1,6 +1,6 @@
 
 <file path=word/document.xml><?xml version="1.0" encoding="utf-8"?>
-<w:document xmlns:wpc="http://schemas.microsoft.com/office/word/2010/wordprocessingCanvas" xmlns:cx="http://schemas.microsoft.com/office/drawing/2014/chartex" xmlns:cx1="http://schemas.microsoft.com/office/drawing/2015/9/8/chartex" xmlns:cx2="http://schemas.microsoft.com/office/drawing/2015/10/21/chartex" xmlns:cx3="http://schemas.microsoft.com/office/drawing/2016/5/9/chartex" xmlns:cx4="http://schemas.microsoft.com/office/drawing/2016/5/10/chartex" xmlns:cx5="http://schemas.microsoft.com/office/drawing/2016/5/11/chartex" xmlns:cx6="http://schemas.microsoft.com/office/drawing/2016/5/12/chartex" xmlns:cx7="http://schemas.microsoft.com/office/drawing/2016/5/13/chartex" xmlns:cx8="http://schemas.microsoft.com/office/drawing/2016/5/14/chartex" xmlns:mc="http://schemas.openxmlformats.org/markup-compatibility/2006" xmlns:aink="http://schemas.microsoft.com/office/drawing/2016/ink" xmlns:am3d="http://schemas.microsoft.com/office/drawing/2017/model3d" xmlns:o="urn:schemas-microsoft-com:office:office" xmlns:oel="http://schemas.microsoft.com/office/2019/extlst" xmlns:r="http://schemas.openxmlformats.org/officeDocument/2006/relationships" xmlns:m="http://schemas.openxmlformats.org/officeDocument/2006/math" xmlns:v="urn:schemas-microsoft-com:vml" xmlns:wp14="http://schemas.microsoft.com/office/word/2010/wordprocessingDrawing" xmlns:wp="http://schemas.openxmlformats.org/drawingml/2006/wordprocessingDrawing" xmlns:w10="urn:schemas-microsoft-com:office:word" xmlns:w="http://schemas.openxmlformats.org/wordprocessingml/2006/main" xmlns:w14="http://schemas.microsoft.com/office/word/2010/wordml" xmlns:w15="http://schemas.microsoft.com/office/word/2012/wordml" xmlns:w16cei="http://schemas.microsoft.com/office/word/2026/wordml/cei" xmlns:w16cex="http://schemas.microsoft.com/office/word/2018/wordml/cex" xmlns:w16cid="http://schemas.microsoft.com/office/word/2016/wordml/cid" xmlns:w16="http://schemas.microsoft.com/office/word/2018/wordml" xmlns:w16du="http://schemas.microsoft.com/office/word/2023/wordml/word16du" xmlns:w16sdtdh="http://schemas.microsoft.com/office/word/2020/wordml/sdtdatahash" xmlns:w16sdtfl="http://schemas.microsoft.com/office/word/2024/wordml/sdtformatlock" xmlns:w16se="http://schemas.microsoft.com/office/word/2015/wordml/symex" xmlns:wpg="http://schemas.microsoft.com/office/word/2010/wordprocessingGroup" xmlns:wpi="http://schemas.microsoft.com/office/word/2010/wordprocessingInk" xmlns:wne="http://schemas.microsoft.com/office/word/2006/wordml" xmlns:wps="http://schemas.microsoft.com/office/word/2010/wordprocessingShape" mc:Ignorable="w14 w15 w16se w16cid w16 w16cex w16sdtdh w16sdtfl w16du wp14">
+<w:document xmlns:wpc="http://schemas.microsoft.com/office/word/2010/wordprocessingCanvas" xmlns:cx="http://schemas.microsoft.com/office/drawing/2014/chartex" xmlns:cx1="http://schemas.microsoft.com/office/drawing/2015/9/8/chartex" xmlns:cx2="http://schemas.microsoft.com/office/drawing/2015/10/21/chartex" xmlns:cx3="http://schemas.microsoft.com/office/drawing/2016/5/9/chartex" xmlns:cx4="http://schemas.microsoft.com/office/drawing/2016/5/10/chartex" xmlns:cx5="http://schemas.microsoft.com/office/drawing/2016/5/11/chartex" xmlns:cx6="http://schemas.microsoft.com/office/drawing/2016/5/12/chartex" xmlns:cx7="http://schemas.microsoft.com/office/drawing/2016/5/13/chartex" xmlns:cx8="http://schemas.microsoft.com/office/drawing/2016/5/14/chartex" xmlns:mc="http://schemas.openxmlformats.org/markup-compatibility/2006" xmlns:aink="http://schemas.microsoft.com/office/drawing/2016/ink" xmlns:am3d="http://schemas.microsoft.com/office/drawing/2017/model3d" xmlns:o="urn:schemas-microsoft-com:office:office" xmlns:oel="http://schemas.microsoft.com/office/2019/extlst" xmlns:r="http://schemas.openxmlformats.org/officeDocument/2006/relationships" xmlns:m="http://schemas.openxmlformats.org/officeDocument/2006/math" xmlns:v="urn:schemas-microsoft-com:vml" xmlns:wp14="http://schemas.microsoft.com/office/word/2010/wordprocessingDrawing" xmlns:wp="http://schemas.openxmlformats.org/drawingml/2006/wordprocessingDrawing" xmlns:w10="urn:schemas-microsoft-com:office:word" xmlns:w="http://schemas.openxmlformats.org/wordprocessingml/2006/main" xmlns:w14="http://schemas.microsoft.com/office/word/2010/wordml" xmlns:w15="http://schemas.microsoft.com/office/word/2012/wordml" xmlns:w16cex="http://schemas.microsoft.com/office/word/2018/wordml/cex" xmlns:w16cid="http://schemas.microsoft.com/office/word/2016/wordml/cid" xmlns:w16="http://schemas.microsoft.com/office/word/2018/wordml" xmlns:w16du="http://schemas.microsoft.com/office/word/2023/wordml/word16du" xmlns:w16sdtdh="http://schemas.microsoft.com/office/word/2020/wordml/sdtdatahash" xmlns:w16sdtfl="http://schemas.microsoft.com/office/word/2024/wordml/sdtformatlock" xmlns:w16se="http://schemas.microsoft.com/office/word/2015/wordml/symex" xmlns:wpg="http://schemas.microsoft.com/office/word/2010/wordprocessingGroup" xmlns:wpi="http://schemas.microsoft.com/office/word/2010/wordprocessingInk" xmlns:wne="http://schemas.microsoft.com/office/word/2006/wordml" xmlns:wps="http://schemas.microsoft.com/office/word/2010/wordprocessingShape" mc:Ignorable="w14 w15 w16se w16cid w16 w16cex w16sdtdh w16sdtfl w16du wp14">
   <w:body>
     <w:p>
       <w:pPr>
@@ -774,7 +774,7 @@
           <w:color w:val="000000"/>
           <w:sz w:val="20"/>
           <w:szCs w:val="20"/>
-          <w:lang w:val="en-ID"/>
+          <w:lang w:val="nb-NO"/>
         </w:rPr>
       </w:pPr>
       <w:r>
@@ -783,31 +783,9 @@
           <w:color w:val="000000"/>
           <w:sz w:val="20"/>
           <w:szCs w:val="20"/>
-          <w:lang w:val="en-ID"/>
+          <w:lang w:val="nb-NO"/>
         </w:rPr>
-        <w:t xml:space="preserve">{%p </w:t>
-      </w:r>
-      <w:proofErr w:type="spellStart"/>
-      <w:r>
-        <w:rPr>
-          <w:rFonts w:ascii="Arial" w:hAnsi="Arial" w:cs="Arial"/>
-          <w:color w:val="000000"/>
-          <w:sz w:val="20"/>
-          <w:szCs w:val="20"/>
-          <w:lang w:val="en-ID"/>
-        </w:rPr>
-        <w:t>endfor</w:t>
-      </w:r>
-      <w:proofErr w:type="spellEnd"/>
-      <w:r>
-        <w:rPr>
-          <w:rFonts w:ascii="Arial" w:hAnsi="Arial" w:cs="Arial"/>
-          <w:color w:val="000000"/>
-          <w:sz w:val="20"/>
-          <w:szCs w:val="20"/>
-          <w:lang w:val="en-ID"/>
-        </w:rPr>
-        <w:t xml:space="preserve"> %}</w:t>
+        <w:t>{%p endfor %}</w:t>
       </w:r>
     </w:p>
     <w:p>
@@ -820,7 +798,7 @@
           <w:color w:val="000000"/>
           <w:sz w:val="20"/>
           <w:szCs w:val="20"/>
-          <w:lang w:val="en-ID"/>
+          <w:lang w:val="nb-NO"/>
         </w:rPr>
       </w:pPr>
     </w:p>
@@ -860,6 +838,118 @@
     </w:p>
     <w:p>
       <w:pPr>
+        <w:tabs>
+          <w:tab w:val="left" w:pos="-270"/>
+        </w:tabs>
+        <w:ind w:left="-12" w:right="221" w:hanging="722"/>
+        <w:rPr>
+          <w:rFonts w:ascii="Arial" w:hAnsi="Arial" w:cs="Arial"/>
+          <w:b w:val="0"/>
+          <w:bCs w:val="0"/>
+          <w:sz w:val="20"/>
+          <w:szCs w:val="20"/>
+        </w:rPr>
+      </w:pPr>
+      <w:r>
+        <w:rPr>
+          <w:rFonts w:ascii="Arial" w:hAnsi="Arial" w:cs="Arial"/>
+          <w:sz w:val="20"/>
+          <w:szCs w:val="20"/>
+          <w:lang w:val="id-ID"/>
+        </w:rPr>
+        <w:tab/>
+      </w:r>
+      <w:r>
+        <w:rPr>
+          <w:rFonts w:ascii="Arial" w:hAnsi="Arial" w:cs="Arial"/>
+          <w:b w:val="0"/>
+          <w:bCs w:val="0"/>
+          <w:caps w:val="0"/>
+          <w:sz w:val="20"/>
+          <w:szCs w:val="20"/>
+        </w:rPr>
+        <w:t xml:space="preserve">{%p if </w:t>
+      </w:r>
+      <w:proofErr w:type="spellStart"/>
+      <w:r>
+        <w:rPr>
+          <w:rFonts w:ascii="Arial" w:hAnsi="Arial" w:cs="Arial"/>
+          <w:b w:val="0"/>
+          <w:bCs w:val="0"/>
+          <w:caps w:val="0"/>
+          <w:sz w:val="20"/>
+          <w:szCs w:val="20"/>
+        </w:rPr>
+        <w:t>teks_lampiran</w:t>
+      </w:r>
+      <w:proofErr w:type="spellEnd"/>
+      <w:r>
+        <w:rPr>
+          <w:rFonts w:ascii="Arial" w:hAnsi="Arial" w:cs="Arial"/>
+          <w:b w:val="0"/>
+          <w:bCs w:val="0"/>
+          <w:caps w:val="0"/>
+          <w:sz w:val="20"/>
+          <w:szCs w:val="20"/>
+        </w:rPr>
+        <w:t xml:space="preserve"> %}</w:t>
+      </w:r>
+    </w:p>
+    <w:p>
+      <w:pPr>
+        <w:pStyle w:val="NormalIndent0"/>
+        <w:tabs>
+          <w:tab w:val="clear" w:pos="86"/>
+          <w:tab w:val="left" w:pos="-426"/>
+        </w:tabs>
+        <w:ind w:left="0" w:right="216" w:hanging="374"/>
+        <w:jc w:val="left"/>
+        <w:rPr>
+          <w:rFonts w:ascii="Arial" w:hAnsi="Arial" w:cs="Arial"/>
+          <w:color w:val="000000"/>
+          <w:sz w:val="20"/>
+          <w:szCs w:val="20"/>
+          <w:lang w:val="id-ID"/>
+        </w:rPr>
+      </w:pPr>
+      <w:r>
+        <w:rPr>
+          <w:rFonts w:ascii="Arial" w:hAnsi="Arial" w:cs="Arial"/>
+          <w:sz w:val="20"/>
+          <w:szCs w:val="20"/>
+          <w:lang w:val="id-ID"/>
+        </w:rPr>
+        <w:t>{{ teks_lampiran }}</w:t>
+      </w:r>
+    </w:p>
+    <w:p>
+      <w:pPr>
+        <w:pStyle w:val="NormalIndent0"/>
+        <w:tabs>
+          <w:tab w:val="clear" w:pos="86"/>
+          <w:tab w:val="left" w:pos="-426"/>
+        </w:tabs>
+        <w:ind w:left="0" w:right="216" w:hanging="374"/>
+        <w:jc w:val="left"/>
+        <w:rPr>
+          <w:rFonts w:ascii="Arial" w:hAnsi="Arial" w:cs="Arial"/>
+          <w:color w:val="000000"/>
+          <w:sz w:val="20"/>
+          <w:szCs w:val="20"/>
+          <w:lang w:val="id-ID"/>
+        </w:rPr>
+      </w:pPr>
+      <w:r>
+        <w:rPr>
+          <w:rFonts w:ascii="Arial" w:hAnsi="Arial" w:cs="Arial"/>
+          <w:sz w:val="20"/>
+          <w:szCs w:val="20"/>
+        </w:rPr>
+        <w:t>{%p endif %}</w:t>
+      </w:r>
+    </w:p>
+    <w:p>
+      <w:pPr>
         <w:pStyle w:val="NormalIndent0"/>
         <w:tabs>
           <w:tab w:val="clear" w:pos="86"/>
@@ -944,12 +1034,57 @@
     </w:p>
     <w:p>
       <w:pPr>
+        <w:pStyle w:val="NormalIndent0"/>
+        <w:tabs>
+          <w:tab w:val="clear" w:pos="86"/>
+          <w:tab w:val="left" w:pos="-426"/>
+        </w:tabs>
+        <w:ind w:left="0" w:right="216" w:hanging="374"/>
+        <w:jc w:val="left"/>
+        <w:rPr>
+          <w:rFonts w:ascii="Arial" w:hAnsi="Arial" w:cs="Arial"/>
+          <w:color w:val="000000"/>
+          <w:sz w:val="20"/>
+          <w:szCs w:val="20"/>
+          <w:lang w:val="id-ID"/>
+        </w:rPr>
+      </w:pPr>
+      <w:r>
+        <w:rPr>
+          <w:rFonts w:ascii="Arial" w:hAnsi="Arial" w:cs="Arial"/>
+          <w:color w:val="000000"/>
+          <w:sz w:val="20"/>
+          <w:szCs w:val="20"/>
+        </w:rPr>
+        <w:t xml:space="preserve">{%p if </w:t>
+      </w:r>
+      <w:proofErr w:type="spellStart"/>
+      <w:r>
+        <w:rPr>
+          <w:rFonts w:ascii="Arial" w:hAnsi="Arial" w:cs="Arial"/>
+          <w:color w:val="000000"/>
+          <w:sz w:val="20"/>
+          <w:szCs w:val="20"/>
+        </w:rPr>
+        <w:t>daftar_lampiran</w:t>
+      </w:r>
+      <w:proofErr w:type="spellEnd"/>
+      <w:r>
+        <w:rPr>
+          <w:rFonts w:ascii="Arial" w:hAnsi="Arial" w:cs="Arial"/>
+          <w:color w:val="000000"/>
+          <w:sz w:val="20"/>
+          <w:szCs w:val="20"/>
+        </w:rPr>
+        <w:t xml:space="preserve"> %}</w:t>
+      </w:r>
+    </w:p>
+    <w:p>
+      <w:pPr>
         <w:rPr>
           <w:lang w:val="nb-NO"/>
         </w:rPr>
       </w:pPr>
-    </w:p>
-    <w:p>
       <w:r>
         <w:rPr>
           <w:lang w:val="nb-NO"/>
@@ -1099,6 +1234,33 @@
         <w:t>{%p endfor %}</w:t>
       </w:r>
     </w:p>
+    <w:p>
+      <w:pPr>
+        <w:pStyle w:val="NormalIndent0"/>
+        <w:tabs>
+          <w:tab w:val="clear" w:pos="86"/>
+          <w:tab w:val="left" w:pos="-426"/>
+        </w:tabs>
+        <w:ind w:left="0" w:right="216" w:hanging="374"/>
+        <w:jc w:val="left"/>
+        <w:rPr>
+          <w:rFonts w:ascii="Arial" w:hAnsi="Arial" w:cs="Arial"/>
+          <w:color w:val="000000"/>
+          <w:sz w:val="20"/>
+          <w:szCs w:val="20"/>
+          <w:lang w:val="id-ID"/>
+        </w:rPr>
+      </w:pPr>
+      <w:r>
+        <w:rPr>
+          <w:rFonts w:ascii="Arial" w:hAnsi="Arial" w:cs="Arial"/>
+          <w:color w:val="000000"/>
+          <w:sz w:val="20"/>
+          <w:szCs w:val="20"/>
+        </w:rPr>
+        <w:t>{%p endif %}</w:t>
+      </w:r>
+    </w:p>
     <w:sectPr>
       <w:headerReference w:type="even" r:id="rId8"/>
       <w:headerReference w:type="default" r:id="rId9"/>
@@ -1115,7 +1277,7 @@
 </file>
 
 <file path=word/endnotes.xml><?xml version="1.0" encoding="utf-8"?>
-<w:endnotes xmlns:wpc="http://schemas.microsoft.com/office/word/2010/wordprocessingCanvas" xmlns:cx="http://schemas.microsoft.com/office/drawing/2014/chartex" xmlns:cx1="http://schemas.microsoft.com/office/drawing/2015/9/8/chartex" xmlns:cx2="http://schemas.microsoft.com/office/drawing/2015/10/21/chartex" xmlns:cx3="http://schemas.microsoft.com/office/drawing/2016/5/9/chartex" xmlns:cx4="http://schemas.microsoft.com/office/drawing/2016/5/10/chartex" xmlns:cx5="http://schemas.microsoft.com/office/drawing/2016/5/11/chartex" xmlns:cx6="http://schemas.microsoft.com/office/drawing/2016/5/12/chartex" xmlns:cx7="http://schemas.microsoft.com/office/drawing/2016/5/13/chartex" xmlns:cx8="http://schemas.microsoft.com/office/drawing/2016/5/14/chartex" xmlns:mc="http://schemas.openxmlformats.org/markup-compatibility/2006" xmlns:aink="http://schemas.microsoft.com/office/drawing/2016/ink" xmlns:am3d="http://schemas.microsoft.com/office/drawing/2017/model3d" xmlns:o="urn:schemas-microsoft-com:office:office" xmlns:oel="http://schemas.microsoft.com/office/2019/extlst" xmlns:r="http://schemas.openxmlformats.org/officeDocument/2006/relationships" xmlns:m="http://schemas.openxmlformats.org/officeDocument/2006/math" xmlns:v="urn:schemas-microsoft-com:vml" xmlns:wp14="http://schemas.microsoft.com/office/word/2010/wordprocessingDrawing" xmlns:wp="http://schemas.openxmlformats.org/drawingml/2006/wordprocessingDrawing" xmlns:w10="urn:schemas-microsoft-com:office:word" xmlns:w="http://schemas.openxmlformats.org/wordprocessingml/2006/main" xmlns:w14="http://schemas.microsoft.com/office/word/2010/wordml" xmlns:w15="http://schemas.microsoft.com/office/word/2012/wordml" xmlns:w16cei="http://schemas.microsoft.com/office/word/2026/wordml/cei" xmlns:w16cex="http://schemas.microsoft.com/office/word/2018/wordml/cex" xmlns:w16cid="http://schemas.microsoft.com/office/word/2016/wordml/cid" xmlns:w16="http://schemas.microsoft.com/office/word/2018/wordml" xmlns:w16du="http://schemas.microsoft.com/office/word/2023/wordml/word16du" xmlns:w16sdtdh="http://schemas.microsoft.com/office/word/2020/wordml/sdtdatahash" xmlns:w16sdtfl="http://schemas.microsoft.com/office/word/2024/wordml/sdtformatlock" xmlns:w16se="http://schemas.microsoft.com/office/word/2015/wordml/symex" xmlns:wpg="http://schemas.microsoft.com/office/word/2010/wordprocessingGroup" xmlns:wpi="http://schemas.microsoft.com/office/word/2010/wordprocessingInk" xmlns:wne="http://schemas.microsoft.com/office/word/2006/wordml" xmlns:wps="http://schemas.microsoft.com/office/word/2010/wordprocessingShape" mc:Ignorable="w14 w15 w16se w16cid w16 w16cex w16sdtdh w16sdtfl w16du wp14">
+<w:endnotes xmlns:wpc="http://schemas.microsoft.com/office/word/2010/wordprocessingCanvas" xmlns:cx="http://schemas.microsoft.com/office/drawing/2014/chartex" xmlns:cx1="http://schemas.microsoft.com/office/drawing/2015/9/8/chartex" xmlns:cx2="http://schemas.microsoft.com/office/drawing/2015/10/21/chartex" xmlns:cx3="http://schemas.microsoft.com/office/drawing/2016/5/9/chartex" xmlns:cx4="http://schemas.microsoft.com/office/drawing/2016/5/10/chartex" xmlns:cx5="http://schemas.microsoft.com/office/drawing/2016/5/11/chartex" xmlns:cx6="http://schemas.microsoft.com/office/drawing/2016/5/12/chartex" xmlns:cx7="http://schemas.microsoft.com/office/drawing/2016/5/13/chartex" xmlns:cx8="http://schemas.microsoft.com/office/drawing/2016/5/14/chartex" xmlns:mc="http://schemas.openxmlformats.org/markup-compatibility/2006" xmlns:aink="http://schemas.microsoft.com/office/drawing/2016/ink" xmlns:am3d="http://schemas.microsoft.com/office/drawing/2017/model3d" xmlns:o="urn:schemas-microsoft-com:office:office" xmlns:oel="http://schemas.microsoft.com/office/2019/extlst" xmlns:r="http://schemas.openxmlformats.org/officeDocument/2006/relationships" xmlns:m="http://schemas.openxmlformats.org/officeDocument/2006/math" xmlns:v="urn:schemas-microsoft-com:vml" xmlns:wp14="http://schemas.microsoft.com/office/word/2010/wordprocessingDrawing" xmlns:wp="http://schemas.openxmlformats.org/drawingml/2006/wordprocessingDrawing" xmlns:w10="urn:schemas-microsoft-com:office:word" xmlns:w="http://schemas.openxmlformats.org/wordprocessingml/2006/main" xmlns:w14="http://schemas.microsoft.com/office/word/2010/wordml" xmlns:w15="http://schemas.microsoft.com/office/word/2012/wordml" xmlns:w16cex="http://schemas.microsoft.com/office/word/2018/wordml/cex" xmlns:w16cid="http://schemas.microsoft.com/office/word/2016/wordml/cid" xmlns:w16="http://schemas.microsoft.com/office/word/2018/wordml" xmlns:w16du="http://schemas.microsoft.com/office/word/2023/wordml/word16du" xmlns:w16sdtdh="http://schemas.microsoft.com/office/word/2020/wordml/sdtdatahash" xmlns:w16sdtfl="http://schemas.microsoft.com/office/word/2024/wordml/sdtformatlock" xmlns:w16se="http://schemas.microsoft.com/office/word/2015/wordml/symex" xmlns:wpg="http://schemas.microsoft.com/office/word/2010/wordprocessingGroup" xmlns:wpi="http://schemas.microsoft.com/office/word/2010/wordprocessingInk" xmlns:wne="http://schemas.microsoft.com/office/word/2006/wordml" xmlns:wps="http://schemas.microsoft.com/office/word/2010/wordprocessingShape" mc:Ignorable="w14 w15 w16se w16cid w16 w16cex w16sdtdh w16sdtfl w16du wp14">
   <w:endnote w:type="separator" w:id="-1">
     <w:p>
       <w:r>
@@ -1134,7 +1296,7 @@
 </file>
 
 <file path=word/footer1.xml><?xml version="1.0" encoding="utf-8"?>
-<w:ftr xmlns:wpc="http://schemas.microsoft.com/office/word/2010/wordprocessingCanvas" xmlns:cx="http://schemas.microsoft.com/office/drawing/2014/chartex" xmlns:cx1="http://schemas.microsoft.com/office/drawing/2015/9/8/chartex" xmlns:cx2="http://schemas.microsoft.com/office/drawing/2015/10/21/chartex" xmlns:cx3="http://schemas.microsoft.com/office/drawing/2016/5/9/chartex" xmlns:cx4="http://schemas.microsoft.com/office/drawing/2016/5/10/chartex" xmlns:cx5="http://schemas.microsoft.com/office/drawing/2016/5/11/chartex" xmlns:cx6="http://schemas.microsoft.com/office/drawing/2016/5/12/chartex" xmlns:cx7="http://schemas.microsoft.com/office/drawing/2016/5/13/chartex" xmlns:cx8="http://schemas.microsoft.com/office/drawing/2016/5/14/chartex" xmlns:mc="http://schemas.openxmlformats.org/markup-compatibility/2006" xmlns:aink="http://schemas.microsoft.com/office/drawing/2016/ink" xmlns:am3d="http://schemas.microsoft.com/office/drawing/2017/model3d" xmlns:o="urn:schemas-microsoft-com:office:office" xmlns:oel="http://schemas.microsoft.com/office/2019/extlst" xmlns:r="http://schemas.openxmlformats.org/officeDocument/2006/relationships" xmlns:m="http://schemas.openxmlformats.org/officeDocument/2006/math" xmlns:v="urn:schemas-microsoft-com:vml" xmlns:wp14="http://schemas.microsoft.com/office/word/2010/wordprocessingDrawing" xmlns:wp="http://schemas.openxmlformats.org/drawingml/2006/wordprocessingDrawing" xmlns:w10="urn:schemas-microsoft-com:office:word" xmlns:w="http://schemas.openxmlformats.org/wordprocessingml/2006/main" xmlns:w14="http://schemas.microsoft.com/office/word/2010/wordml" xmlns:w15="http://schemas.microsoft.com/office/word/2012/wordml" xmlns:w16cei="http://schemas.microsoft.com/office/word/2026/wordml/cei" xmlns:w16cex="http://schemas.microsoft.com/office/word/2018/wordml/cex" xmlns:w16cid="http://schemas.microsoft.com/office/word/2016/wordml/cid" xmlns:w16="http://schemas.microsoft.com/office/word/2018/wordml" xmlns:w16du="http://schemas.microsoft.com/office/word/2023/wordml/word16du" xmlns:w16sdtdh="http://schemas.microsoft.com/office/word/2020/wordml/sdtdatahash" xmlns:w16sdtfl="http://schemas.microsoft.com/office/word/2024/wordml/sdtformatlock" xmlns:w16se="http://schemas.microsoft.com/office/word/2015/wordml/symex" xmlns:wpg="http://schemas.microsoft.com/office/word/2010/wordprocessingGroup" xmlns:wpi="http://schemas.microsoft.com/office/word/2010/wordprocessingInk" xmlns:wne="http://schemas.microsoft.com/office/word/2006/wordml" xmlns:wps="http://schemas.microsoft.com/office/word/2010/wordprocessingShape" mc:Ignorable="w14 w15 w16se w16cid w16 w16cex w16sdtdh w16sdtfl w16du wp14">
+<w:ftr xmlns:wpc="http://schemas.microsoft.com/office/word/2010/wordprocessingCanvas" xmlns:cx="http://schemas.microsoft.com/office/drawing/2014/chartex" xmlns:cx1="http://schemas.microsoft.com/office/drawing/2015/9/8/chartex" xmlns:cx2="http://schemas.microsoft.com/office/drawing/2015/10/21/chartex" xmlns:cx3="http://schemas.microsoft.com/office/drawing/2016/5/9/chartex" xmlns:cx4="http://schemas.microsoft.com/office/drawing/2016/5/10/chartex" xmlns:cx5="http://schemas.microsoft.com/office/drawing/2016/5/11/chartex" xmlns:cx6="http://schemas.microsoft.com/office/drawing/2016/5/12/chartex" xmlns:cx7="http://schemas.microsoft.com/office/drawing/2016/5/13/chartex" xmlns:cx8="http://schemas.microsoft.com/office/drawing/2016/5/14/chartex" xmlns:mc="http://schemas.openxmlformats.org/markup-compatibility/2006" xmlns:aink="http://schemas.microsoft.com/office/drawing/2016/ink" xmlns:am3d="http://schemas.microsoft.com/office/drawing/2017/model3d" xmlns:o="urn:schemas-microsoft-com:office:office" xmlns:oel="http://schemas.microsoft.com/office/2019/extlst" xmlns:r="http://schemas.openxmlformats.org/officeDocument/2006/relationships" xmlns:m="http://schemas.openxmlformats.org/officeDocument/2006/math" xmlns:v="urn:schemas-microsoft-com:vml" xmlns:wp14="http://schemas.microsoft.com/office/word/2010/wordprocessingDrawing" xmlns:wp="http://schemas.openxmlformats.org/drawingml/2006/wordprocessingDrawing" xmlns:w10="urn:schemas-microsoft-com:office:word" xmlns:w="http://schemas.openxmlformats.org/wordprocessingml/2006/main" xmlns:w14="http://schemas.microsoft.com/office/word/2010/wordml" xmlns:w15="http://schemas.microsoft.com/office/word/2012/wordml" xmlns:w16cex="http://schemas.microsoft.com/office/word/2018/wordml/cex" xmlns:w16cid="http://schemas.microsoft.com/office/word/2016/wordml/cid" xmlns:w16="http://schemas.microsoft.com/office/word/2018/wordml" xmlns:w16du="http://schemas.microsoft.com/office/word/2023/wordml/word16du" xmlns:w16sdtdh="http://schemas.microsoft.com/office/word/2020/wordml/sdtdatahash" xmlns:w16sdtfl="http://schemas.microsoft.com/office/word/2024/wordml/sdtformatlock" xmlns:w16se="http://schemas.microsoft.com/office/word/2015/wordml/symex" xmlns:wpg="http://schemas.microsoft.com/office/word/2010/wordprocessingGroup" xmlns:wpi="http://schemas.microsoft.com/office/word/2010/wordprocessingInk" xmlns:wne="http://schemas.microsoft.com/office/word/2006/wordml" xmlns:wps="http://schemas.microsoft.com/office/word/2010/wordprocessingShape" mc:Ignorable="w14 w15 w16se w16cid w16 w16cex w16sdtdh w16sdtfl w16du wp14">
   <w:p>
     <w:pPr>
       <w:pStyle w:val="Footer"/>
@@ -1144,7 +1306,7 @@
 </file>
 
 <file path=word/footer2.xml><?xml version="1.0" encoding="utf-8"?>
-<w:ftr xmlns:wpc="http://schemas.microsoft.com/office/word/2010/wordprocessingCanvas" xmlns:cx="http://schemas.microsoft.com/office/drawing/2014/chartex" xmlns:cx1="http://schemas.microsoft.com/office/drawing/2015/9/8/chartex" xmlns:cx2="http://schemas.microsoft.com/office/drawing/2015/10/21/chartex" xmlns:cx3="http://schemas.microsoft.com/office/drawing/2016/5/9/chartex" xmlns:cx4="http://schemas.microsoft.com/office/drawing/2016/5/10/chartex" xmlns:cx5="http://schemas.microsoft.com/office/drawing/2016/5/11/chartex" xmlns:cx6="http://schemas.microsoft.com/office/drawing/2016/5/12/chartex" xmlns:cx7="http://schemas.microsoft.com/office/drawing/2016/5/13/chartex" xmlns:cx8="http://schemas.microsoft.com/office/drawing/2016/5/14/chartex" xmlns:mc="http://schemas.openxmlformats.org/markup-compatibility/2006" xmlns:aink="http://schemas.microsoft.com/office/drawing/2016/ink" xmlns:am3d="http://schemas.microsoft.com/office/drawing/2017/model3d" xmlns:o="urn:schemas-microsoft-com:office:office" xmlns:oel="http://schemas.microsoft.com/office/2019/extlst" xmlns:r="http://schemas.openxmlformats.org/officeDocument/2006/relationships" xmlns:m="http://schemas.openxmlformats.org/officeDocument/2006/math" xmlns:v="urn:schemas-microsoft-com:vml" xmlns:wp14="http://schemas.microsoft.com/office/word/2010/wordprocessingDrawing" xmlns:wp="http://schemas.openxmlformats.org/drawingml/2006/wordprocessingDrawing" xmlns:w10="urn:schemas-microsoft-com:office:word" xmlns:w="http://schemas.openxmlformats.org/wordprocessingml/2006/main" xmlns:w14="http://schemas.microsoft.com/office/word/2010/wordml" xmlns:w15="http://schemas.microsoft.com/office/word/2012/wordml" xmlns:w16cei="http://schemas.microsoft.com/office/word/2026/wordml/cei" xmlns:w16cex="http://schemas.microsoft.com/office/word/2018/wordml/cex" xmlns:w16cid="http://schemas.microsoft.com/office/word/2016/wordml/cid" xmlns:w16="http://schemas.microsoft.com/office/word/2018/wordml" xmlns:w16du="http://schemas.microsoft.com/office/word/2023/wordml/word16du" xmlns:w16sdtdh="http://schemas.microsoft.com/office/word/2020/wordml/sdtdatahash" xmlns:w16sdtfl="http://schemas.microsoft.com/office/word/2024/wordml/sdtformatlock" xmlns:w16se="http://schemas.microsoft.com/office/word/2015/wordml/symex" xmlns:wpg="http://schemas.microsoft.com/office/word/2010/wordprocessingGroup" xmlns:wpi="http://schemas.microsoft.com/office/word/2010/wordprocessingInk" xmlns:wne="http://schemas.microsoft.com/office/word/2006/wordml" xmlns:wps="http://schemas.microsoft.com/office/word/2010/wordprocessingShape" mc:Ignorable="w14 w15 w16se w16cid w16 w16cex w16sdtdh w16sdtfl w16du wp14">
+<w:ftr xmlns:wpc="http://schemas.microsoft.com/office/word/2010/wordprocessingCanvas" xmlns:cx="http://schemas.microsoft.com/office/drawing/2014/chartex" xmlns:cx1="http://schemas.microsoft.com/office/drawing/2015/9/8/chartex" xmlns:cx2="http://schemas.microsoft.com/office/drawing/2015/10/21/chartex" xmlns:cx3="http://schemas.microsoft.com/office/drawing/2016/5/9/chartex" xmlns:cx4="http://schemas.microsoft.com/office/drawing/2016/5/10/chartex" xmlns:cx5="http://schemas.microsoft.com/office/drawing/2016/5/11/chartex" xmlns:cx6="http://schemas.microsoft.com/office/drawing/2016/5/12/chartex" xmlns:cx7="http://schemas.microsoft.com/office/drawing/2016/5/13/chartex" xmlns:cx8="http://schemas.microsoft.com/office/drawing/2016/5/14/chartex" xmlns:mc="http://schemas.openxmlformats.org/markup-compatibility/2006" xmlns:aink="http://schemas.microsoft.com/office/drawing/2016/ink" xmlns:am3d="http://schemas.microsoft.com/office/drawing/2017/model3d" xmlns:o="urn:schemas-microsoft-com:office:office" xmlns:oel="http://schemas.microsoft.com/office/2019/extlst" xmlns:r="http://schemas.openxmlformats.org/officeDocument/2006/relationships" xmlns:m="http://schemas.openxmlformats.org/officeDocument/2006/math" xmlns:v="urn:schemas-microsoft-com:vml" xmlns:wp14="http://schemas.microsoft.com/office/word/2010/wordprocessingDrawing" xmlns:wp="http://schemas.openxmlformats.org/drawingml/2006/wordprocessingDrawing" xmlns:w10="urn:schemas-microsoft-com:office:word" xmlns:w="http://schemas.openxmlformats.org/wordprocessingml/2006/main" xmlns:w14="http://schemas.microsoft.com/office/word/2010/wordml" xmlns:w15="http://schemas.microsoft.com/office/word/2012/wordml" xmlns:w16cex="http://schemas.microsoft.com/office/word/2018/wordml/cex" xmlns:w16cid="http://schemas.microsoft.com/office/word/2016/wordml/cid" xmlns:w16="http://schemas.microsoft.com/office/word/2018/wordml" xmlns:w16du="http://schemas.microsoft.com/office/word/2023/wordml/word16du" xmlns:w16sdtdh="http://schemas.microsoft.com/office/word/2020/wordml/sdtdatahash" xmlns:w16sdtfl="http://schemas.microsoft.com/office/word/2024/wordml/sdtformatlock" xmlns:w16se="http://schemas.microsoft.com/office/word/2015/wordml/symex" xmlns:wpg="http://schemas.microsoft.com/office/word/2010/wordprocessingGroup" xmlns:wpi="http://schemas.microsoft.com/office/word/2010/wordprocessingInk" xmlns:wne="http://schemas.microsoft.com/office/word/2006/wordml" xmlns:wps="http://schemas.microsoft.com/office/word/2010/wordprocessingShape" mc:Ignorable="w14 w15 w16se w16cid w16 w16cex w16sdtdh w16sdtfl w16du wp14">
   <w:tbl>
     <w:tblPr>
       <w:tblStyle w:val="TableGrid"/>
@@ -1306,7 +1468,7 @@
                   </wp:anchor>
                 </w:drawing>
               </mc:Choice>
-              <mc:Fallback>
+              <mc:Fallback xmlns:w16cei="http://schemas.microsoft.com/office/word/2026/wordml/cei">
                 <w:pict>
                   <v:line w14:anchorId="3D1EE0CF" id="Line 411" o:spid="_x0000_s1026" style="position:absolute;z-index:251676160;visibility:visible;mso-wrap-style:square;mso-width-percent:0;mso-height-percent:0;mso-wrap-distance-left:9pt;mso-wrap-distance-top:0;mso-wrap-distance-right:9pt;mso-wrap-distance-bottom:0;mso-position-horizontal:absolute;mso-position-horizontal-relative:text;mso-position-vertical:absolute;mso-position-vertical-relative:text;mso-width-percent:0;mso-height-percent:0;mso-width-relative:page;mso-height-relative:page" from="-4.75pt,-.7pt" to="-4.75pt,68pt" o:gfxdata="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" o:allowincell="f" strokeweight="1.5pt">
                     <v:stroke startarrowwidth="narrow" startarrowlength="short" endarrowwidth="narrow" endarrowlength="short"/>
@@ -1419,7 +1581,7 @@
                   </wp:anchor>
                 </w:drawing>
               </mc:Choice>
-              <mc:Fallback>
+              <mc:Fallback xmlns:w16cei="http://schemas.microsoft.com/office/word/2026/wordml/cei">
                 <w:pict>
                   <v:line w14:anchorId="0265DEAD" id="Line 411" o:spid="_x0000_s1026" style="position:absolute;z-index:251674112;visibility:visible;mso-wrap-style:square;mso-width-percent:0;mso-height-percent:0;mso-wrap-distance-left:9pt;mso-wrap-distance-top:0;mso-wrap-distance-right:9pt;mso-wrap-distance-bottom:0;mso-position-horizontal:absolute;mso-position-horizontal-relative:text;mso-position-vertical:absolute;mso-position-vertical-relative:text;mso-width-percent:0;mso-height-percent:0;mso-width-relative:page;mso-height-relative:page" from="164.45pt,-25.15pt" to="164.45pt,42.35pt" o:gfxdata="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" o:allowincell="f" strokeweight="1.5pt">
                     <v:stroke startarrowwidth="narrow" startarrowlength="short" endarrowwidth="narrow" endarrowlength="short"/>
@@ -1663,7 +1825,7 @@
             </wp:anchor>
           </w:drawing>
         </mc:Choice>
-        <mc:Fallback>
+        <mc:Fallback xmlns:w16cei="http://schemas.microsoft.com/office/word/2026/wordml/cei">
           <w:pict>
             <v:line w14:anchorId="3F87756F" id="Line 413" o:spid="_x0000_s1026" style="position:absolute;flip:x;z-index:251672064;visibility:visible;mso-wrap-style:square;mso-width-percent:0;mso-height-percent:0;mso-wrap-distance-left:9pt;mso-wrap-distance-top:0;mso-wrap-distance-right:9pt;mso-wrap-distance-bottom:0;mso-position-horizontal:absolute;mso-position-horizontal-relative:text;mso-position-vertical:absolute;mso-position-vertical-relative:text;mso-width-percent:0;mso-height-percent:0;mso-width-relative:page;mso-height-relative:page" from="-42.9pt,-76.85pt" to="467.4pt,-76.8pt" o:gfxdata="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" strokeweight="1.5pt"/>
           </w:pict>
@@ -1747,7 +1909,7 @@
             </wp:anchor>
           </w:drawing>
         </mc:Choice>
-        <mc:Fallback>
+        <mc:Fallback xmlns:w16cei="http://schemas.microsoft.com/office/word/2026/wordml/cei">
           <w:pict>
             <v:line w14:anchorId="0F7A8681" id="Line 357" o:spid="_x0000_s1026" style="position:absolute;z-index:251647488;visibility:visible;mso-wrap-style:square;mso-width-percent:0;mso-height-percent:0;mso-wrap-distance-left:9pt;mso-wrap-distance-top:0;mso-wrap-distance-right:9pt;mso-wrap-distance-bottom:0;mso-position-horizontal:absolute;mso-position-horizontal-relative:text;mso-position-vertical:absolute;mso-position-vertical-relative:text;mso-width-percent:0;mso-height-percent:0;mso-width-relative:page;mso-height-relative:page" from="90pt,-88.35pt" to="90.05pt,-9.1pt" o:gfxdata="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" o:allowincell="f" stroked="f" strokeweight="1pt">
               <v:stroke startarrowwidth="narrow" startarrowlength="short" endarrowwidth="narrow" endarrowlength="short"/>
@@ -1832,7 +1994,7 @@
             </wp:anchor>
           </w:drawing>
         </mc:Choice>
-        <mc:Fallback>
+        <mc:Fallback xmlns:w16cei="http://schemas.microsoft.com/office/word/2026/wordml/cei">
           <w:pict>
             <v:line w14:anchorId="29DC1A25" id="Line 356" o:spid="_x0000_s1026" style="position:absolute;flip:x;z-index:251646464;visibility:visible;mso-wrap-style:square;mso-width-percent:0;mso-height-percent:0;mso-wrap-distance-left:9pt;mso-wrap-distance-top:0;mso-wrap-distance-right:9pt;mso-wrap-distance-bottom:0;mso-position-horizontal:absolute;mso-position-horizontal-relative:text;mso-position-vertical:absolute;mso-position-vertical-relative:text;mso-width-percent:0;mso-height-percent:0;mso-width-relative:page;mso-height-relative:page" from="14.6pt,684.8pt" to="524.35pt,684.85pt" o:gfxdata="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" o:allowincell="f" strokeweight="1.5pt"/>
           </w:pict>
@@ -1915,7 +2077,7 @@
             </wp:anchor>
           </w:drawing>
         </mc:Choice>
-        <mc:Fallback>
+        <mc:Fallback xmlns:w16cei="http://schemas.microsoft.com/office/word/2026/wordml/cei">
           <w:pict>
             <v:line w14:anchorId="1FEBBAD1" id="Line 355" o:spid="_x0000_s1026" style="position:absolute;flip:x;z-index:251645440;visibility:visible;mso-wrap-style:square;mso-width-percent:0;mso-height-percent:0;mso-wrap-distance-left:9pt;mso-wrap-distance-top:0;mso-wrap-distance-right:9pt;mso-wrap-distance-bottom:0;mso-position-horizontal:absolute;mso-position-horizontal-relative:text;mso-position-vertical:absolute;mso-position-vertical-relative:text;mso-width-percent:0;mso-height-percent:0;mso-width-relative:page;mso-height-relative:page" from="-3.4pt,666.8pt" to="506.35pt,666.85pt" o:gfxdata="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" o:allowincell="f" strokeweight="1.5pt"/>
           </w:pict>
@@ -1927,7 +2089,7 @@
 </file>
 
 <file path=word/footer3.xml><?xml version="1.0" encoding="utf-8"?>
-<w:ftr xmlns:wpc="http://schemas.microsoft.com/office/word/2010/wordprocessingCanvas" xmlns:cx="http://schemas.microsoft.com/office/drawing/2014/chartex" xmlns:cx1="http://schemas.microsoft.com/office/drawing/2015/9/8/chartex" xmlns:cx2="http://schemas.microsoft.com/office/drawing/2015/10/21/chartex" xmlns:cx3="http://schemas.microsoft.com/office/drawing/2016/5/9/chartex" xmlns:cx4="http://schemas.microsoft.com/office/drawing/2016/5/10/chartex" xmlns:cx5="http://schemas.microsoft.com/office/drawing/2016/5/11/chartex" xmlns:cx6="http://schemas.microsoft.com/office/drawing/2016/5/12/chartex" xmlns:cx7="http://schemas.microsoft.com/office/drawing/2016/5/13/chartex" xmlns:cx8="http://schemas.microsoft.com/office/drawing/2016/5/14/chartex" xmlns:mc="http://schemas.openxmlformats.org/markup-compatibility/2006" xmlns:aink="http://schemas.microsoft.com/office/drawing/2016/ink" xmlns:am3d="http://schemas.microsoft.com/office/drawing/2017/model3d" xmlns:o="urn:schemas-microsoft-com:office:office" xmlns:oel="http://schemas.microsoft.com/office/2019/extlst" xmlns:r="http://schemas.openxmlformats.org/officeDocument/2006/relationships" xmlns:m="http://schemas.openxmlformats.org/officeDocument/2006/math" xmlns:v="urn:schemas-microsoft-com:vml" xmlns:wp14="http://schemas.microsoft.com/office/word/2010/wordprocessingDrawing" xmlns:wp="http://schemas.openxmlformats.org/drawingml/2006/wordprocessingDrawing" xmlns:w10="urn:schemas-microsoft-com:office:word" xmlns:w="http://schemas.openxmlformats.org/wordprocessingml/2006/main" xmlns:w14="http://schemas.microsoft.com/office/word/2010/wordml" xmlns:w15="http://schemas.microsoft.com/office/word/2012/wordml" xmlns:w16cei="http://schemas.microsoft.com/office/word/2026/wordml/cei" xmlns:w16cex="http://schemas.microsoft.com/office/word/2018/wordml/cex" xmlns:w16cid="http://schemas.microsoft.com/office/word/2016/wordml/cid" xmlns:w16="http://schemas.microsoft.com/office/word/2018/wordml" xmlns:w16du="http://schemas.microsoft.com/office/word/2023/wordml/word16du" xmlns:w16sdtdh="http://schemas.microsoft.com/office/word/2020/wordml/sdtdatahash" xmlns:w16sdtfl="http://schemas.microsoft.com/office/word/2024/wordml/sdtformatlock" xmlns:w16se="http://schemas.microsoft.com/office/word/2015/wordml/symex" xmlns:wpg="http://schemas.microsoft.com/office/word/2010/wordprocessingGroup" xmlns:wpi="http://schemas.microsoft.com/office/word/2010/wordprocessingInk" xmlns:wne="http://schemas.microsoft.com/office/word/2006/wordml" xmlns:wps="http://schemas.microsoft.com/office/word/2010/wordprocessingShape" mc:Ignorable="w14 w15 w16se w16cid w16 w16cex w16sdtdh w16sdtfl w16du wp14">
+<w:ftr xmlns:wpc="http://schemas.microsoft.com/office/word/2010/wordprocessingCanvas" xmlns:cx="http://schemas.microsoft.com/office/drawing/2014/chartex" xmlns:cx1="http://schemas.microsoft.com/office/drawing/2015/9/8/chartex" xmlns:cx2="http://schemas.microsoft.com/office/drawing/2015/10/21/chartex" xmlns:cx3="http://schemas.microsoft.com/office/drawing/2016/5/9/chartex" xmlns:cx4="http://schemas.microsoft.com/office/drawing/2016/5/10/chartex" xmlns:cx5="http://schemas.microsoft.com/office/drawing/2016/5/11/chartex" xmlns:cx6="http://schemas.microsoft.com/office/drawing/2016/5/12/chartex" xmlns:cx7="http://schemas.microsoft.com/office/drawing/2016/5/13/chartex" xmlns:cx8="http://schemas.microsoft.com/office/drawing/2016/5/14/chartex" xmlns:mc="http://schemas.openxmlformats.org/markup-compatibility/2006" xmlns:aink="http://schemas.microsoft.com/office/drawing/2016/ink" xmlns:am3d="http://schemas.microsoft.com/office/drawing/2017/model3d" xmlns:o="urn:schemas-microsoft-com:office:office" xmlns:oel="http://schemas.microsoft.com/office/2019/extlst" xmlns:r="http://schemas.openxmlformats.org/officeDocument/2006/relationships" xmlns:m="http://schemas.openxmlformats.org/officeDocument/2006/math" xmlns:v="urn:schemas-microsoft-com:vml" xmlns:wp14="http://schemas.microsoft.com/office/word/2010/wordprocessingDrawing" xmlns:wp="http://schemas.openxmlformats.org/drawingml/2006/wordprocessingDrawing" xmlns:w10="urn:schemas-microsoft-com:office:word" xmlns:w="http://schemas.openxmlformats.org/wordprocessingml/2006/main" xmlns:w14="http://schemas.microsoft.com/office/word/2010/wordml" xmlns:w15="http://schemas.microsoft.com/office/word/2012/wordml" xmlns:w16cex="http://schemas.microsoft.com/office/word/2018/wordml/cex" xmlns:w16cid="http://schemas.microsoft.com/office/word/2016/wordml/cid" xmlns:w16="http://schemas.microsoft.com/office/word/2018/wordml" xmlns:w16du="http://schemas.microsoft.com/office/word/2023/wordml/word16du" xmlns:w16sdtdh="http://schemas.microsoft.com/office/word/2020/wordml/sdtdatahash" xmlns:w16sdtfl="http://schemas.microsoft.com/office/word/2024/wordml/sdtformatlock" xmlns:w16se="http://schemas.microsoft.com/office/word/2015/wordml/symex" xmlns:wpg="http://schemas.microsoft.com/office/word/2010/wordprocessingGroup" xmlns:wpi="http://schemas.microsoft.com/office/word/2010/wordprocessingInk" xmlns:wne="http://schemas.microsoft.com/office/word/2006/wordml" xmlns:wps="http://schemas.microsoft.com/office/word/2010/wordprocessingShape" mc:Ignorable="w14 w15 w16se w16cid w16 w16cex w16sdtdh w16sdtfl w16du wp14">
   <w:p>
     <w:pPr>
       <w:pStyle w:val="Footer"/>
@@ -1937,7 +2099,7 @@
 </file>
 
 <file path=word/footnotes.xml><?xml version="1.0" encoding="utf-8"?>
-<w:footnotes xmlns:wpc="http://schemas.microsoft.com/office/word/2010/wordprocessingCanvas" xmlns:cx="http://schemas.microsoft.com/office/drawing/2014/chartex" xmlns:cx1="http://schemas.microsoft.com/office/drawing/2015/9/8/chartex" xmlns:cx2="http://schemas.microsoft.com/office/drawing/2015/10/21/chartex" xmlns:cx3="http://schemas.microsoft.com/office/drawing/2016/5/9/chartex" xmlns:cx4="http://schemas.microsoft.com/office/drawing/2016/5/10/chartex" xmlns:cx5="http://schemas.microsoft.com/office/drawing/2016/5/11/chartex" xmlns:cx6="http://schemas.microsoft.com/office/drawing/2016/5/12/chartex" xmlns:cx7="http://schemas.microsoft.com/office/drawing/2016/5/13/chartex" xmlns:cx8="http://schemas.microsoft.com/office/drawing/2016/5/14/chartex" xmlns:mc="http://schemas.openxmlformats.org/markup-compatibility/2006" xmlns:aink="http://schemas.microsoft.com/office/drawing/2016/ink" xmlns:am3d="http://schemas.microsoft.com/office/drawing/2017/model3d" xmlns:o="urn:schemas-microsoft-com:office:office" xmlns:oel="http://schemas.microsoft.com/office/2019/extlst" xmlns:r="http://schemas.openxmlformats.org/officeDocument/2006/relationships" xmlns:m="http://schemas.openxmlformats.org/officeDocument/2006/math" xmlns:v="urn:schemas-microsoft-com:vml" xmlns:wp14="http://schemas.microsoft.com/office/word/2010/wordprocessingDrawing" xmlns:wp="http://schemas.openxmlformats.org/drawingml/2006/wordprocessingDrawing" xmlns:w10="urn:schemas-microsoft-com:office:word" xmlns:w="http://schemas.openxmlformats.org/wordprocessingml/2006/main" xmlns:w14="http://schemas.microsoft.com/office/word/2010/wordml" xmlns:w15="http://schemas.microsoft.com/office/word/2012/wordml" xmlns:w16cei="http://schemas.microsoft.com/office/word/2026/wordml/cei" xmlns:w16cex="http://schemas.microsoft.com/office/word/2018/wordml/cex" xmlns:w16cid="http://schemas.microsoft.com/office/word/2016/wordml/cid" xmlns:w16="http://schemas.microsoft.com/office/word/2018/wordml" xmlns:w16du="http://schemas.microsoft.com/office/word/2023/wordml/word16du" xmlns:w16sdtdh="http://schemas.microsoft.com/office/word/2020/wordml/sdtdatahash" xmlns:w16sdtfl="http://schemas.microsoft.com/office/word/2024/wordml/sdtformatlock" xmlns:w16se="http://schemas.microsoft.com/office/word/2015/wordml/symex" xmlns:wpg="http://schemas.microsoft.com/office/word/2010/wordprocessingGroup" xmlns:wpi="http://schemas.microsoft.com/office/word/2010/wordprocessingInk" xmlns:wne="http://schemas.microsoft.com/office/word/2006/wordml" xmlns:wps="http://schemas.microsoft.com/office/word/2010/wordprocessingShape" mc:Ignorable="w14 w15 w16se w16cid w16 w16cex w16sdtdh w16sdtfl w16du wp14">
+<w:footnotes xmlns:wpc="http://schemas.microsoft.com/office/word/2010/wordprocessingCanvas" xmlns:cx="http://schemas.microsoft.com/office/drawing/2014/chartex" xmlns:cx1="http://schemas.microsoft.com/office/drawing/2015/9/8/chartex" xmlns:cx2="http://schemas.microsoft.com/office/drawing/2015/10/21/chartex" xmlns:cx3="http://schemas.microsoft.com/office/drawing/2016/5/9/chartex" xmlns:cx4="http://schemas.microsoft.com/office/drawing/2016/5/10/chartex" xmlns:cx5="http://schemas.microsoft.com/office/drawing/2016/5/11/chartex" xmlns:cx6="http://schemas.microsoft.com/office/drawing/2016/5/12/chartex" xmlns:cx7="http://schemas.microsoft.com/office/drawing/2016/5/13/chartex" xmlns:cx8="http://schemas.microsoft.com/office/drawing/2016/5/14/chartex" xmlns:mc="http://schemas.openxmlformats.org/markup-compatibility/2006" xmlns:aink="http://schemas.microsoft.com/office/drawing/2016/ink" xmlns:am3d="http://schemas.microsoft.com/office/drawing/2017/model3d" xmlns:o="urn:schemas-microsoft-com:office:office" xmlns:oel="http://schemas.microsoft.com/office/2019/extlst" xmlns:r="http://schemas.openxmlformats.org/officeDocument/2006/relationships" xmlns:m="http://schemas.openxmlformats.org/officeDocument/2006/math" xmlns:v="urn:schemas-microsoft-com:vml" xmlns:wp14="http://schemas.microsoft.com/office/word/2010/wordprocessingDrawing" xmlns:wp="http://schemas.openxmlformats.org/drawingml/2006/wordprocessingDrawing" xmlns:w10="urn:schemas-microsoft-com:office:word" xmlns:w="http://schemas.openxmlformats.org/wordprocessingml/2006/main" xmlns:w14="http://schemas.microsoft.com/office/word/2010/wordml" xmlns:w15="http://schemas.microsoft.com/office/word/2012/wordml" xmlns:w16cex="http://schemas.microsoft.com/office/word/2018/wordml/cex" xmlns:w16cid="http://schemas.microsoft.com/office/word/2016/wordml/cid" xmlns:w16="http://schemas.microsoft.com/office/word/2018/wordml" xmlns:w16du="http://schemas.microsoft.com/office/word/2023/wordml/word16du" xmlns:w16sdtdh="http://schemas.microsoft.com/office/word/2020/wordml/sdtdatahash" xmlns:w16sdtfl="http://schemas.microsoft.com/office/word/2024/wordml/sdtformatlock" xmlns:w16se="http://schemas.microsoft.com/office/word/2015/wordml/symex" xmlns:wpg="http://schemas.microsoft.com/office/word/2010/wordprocessingGroup" xmlns:wpi="http://schemas.microsoft.com/office/word/2010/wordprocessingInk" xmlns:wne="http://schemas.microsoft.com/office/word/2006/wordml" xmlns:wps="http://schemas.microsoft.com/office/word/2010/wordprocessingShape" mc:Ignorable="w14 w15 w16se w16cid w16 w16cex w16sdtdh w16sdtfl w16du wp14">
   <w:footnote w:type="separator" w:id="-1">
     <w:p>
       <w:r>
@@ -1956,7 +2118,7 @@
 </file>
 
 <file path=word/header1.xml><?xml version="1.0" encoding="utf-8"?>
-<w:hdr xmlns:wpc="http://schemas.microsoft.com/office/word/2010/wordprocessingCanvas" xmlns:cx="http://schemas.microsoft.com/office/drawing/2014/chartex" xmlns:cx1="http://schemas.microsoft.com/office/drawing/2015/9/8/chartex" xmlns:cx2="http://schemas.microsoft.com/office/drawing/2015/10/21/chartex" xmlns:cx3="http://schemas.microsoft.com/office/drawing/2016/5/9/chartex" xmlns:cx4="http://schemas.microsoft.com/office/drawing/2016/5/10/chartex" xmlns:cx5="http://schemas.microsoft.com/office/drawing/2016/5/11/chartex" xmlns:cx6="http://schemas.microsoft.com/office/drawing/2016/5/12/chartex" xmlns:cx7="http://schemas.microsoft.com/office/drawing/2016/5/13/chartex" xmlns:cx8="http://schemas.microsoft.com/office/drawing/2016/5/14/chartex" xmlns:mc="http://schemas.openxmlformats.org/markup-compatibility/2006" xmlns:aink="http://schemas.microsoft.com/office/drawing/2016/ink" xmlns:am3d="http://schemas.microsoft.com/office/drawing/2017/model3d" xmlns:o="urn:schemas-microsoft-com:office:office" xmlns:oel="http://schemas.microsoft.com/office/2019/extlst" xmlns:r="http://schemas.openxmlformats.org/officeDocument/2006/relationships" xmlns:m="http://schemas.openxmlformats.org/officeDocument/2006/math" xmlns:v="urn:schemas-microsoft-com:vml" xmlns:wp14="http://schemas.microsoft.com/office/word/2010/wordprocessingDrawing" xmlns:wp="http://schemas.openxmlformats.org/drawingml/2006/wordprocessingDrawing" xmlns:w10="urn:schemas-microsoft-com:office:word" xmlns:w="http://schemas.openxmlformats.org/wordprocessingml/2006/main" xmlns:w14="http://schemas.microsoft.com/office/word/2010/wordml" xmlns:w15="http://schemas.microsoft.com/office/word/2012/wordml" xmlns:w16cei="http://schemas.microsoft.com/office/word/2026/wordml/cei" xmlns:w16cex="http://schemas.microsoft.com/office/word/2018/wordml/cex" xmlns:w16cid="http://schemas.microsoft.com/office/word/2016/wordml/cid" xmlns:w16="http://schemas.microsoft.com/office/word/2018/wordml" xmlns:w16du="http://schemas.microsoft.com/office/word/2023/wordml/word16du" xmlns:w16sdtdh="http://schemas.microsoft.com/office/word/2020/wordml/sdtdatahash" xmlns:w16sdtfl="http://schemas.microsoft.com/office/word/2024/wordml/sdtformatlock" xmlns:w16se="http://schemas.microsoft.com/office/word/2015/wordml/symex" xmlns:wpg="http://schemas.microsoft.com/office/word/2010/wordprocessingGroup" xmlns:wpi="http://schemas.microsoft.com/office/word/2010/wordprocessingInk" xmlns:wne="http://schemas.microsoft.com/office/word/2006/wordml" xmlns:wps="http://schemas.microsoft.com/office/word/2010/wordprocessingShape" mc:Ignorable="w14 w15 w16se w16cid w16 w16cex w16sdtdh w16sdtfl w16du wp14">
+<w:hdr xmlns:wpc="http://schemas.microsoft.com/office/word/2010/wordprocessingCanvas" xmlns:cx="http://schemas.microsoft.com/office/drawing/2014/chartex" xmlns:cx1="http://schemas.microsoft.com/office/drawing/2015/9/8/chartex" xmlns:cx2="http://schemas.microsoft.com/office/drawing/2015/10/21/chartex" xmlns:cx3="http://schemas.microsoft.com/office/drawing/2016/5/9/chartex" xmlns:cx4="http://schemas.microsoft.com/office/drawing/2016/5/10/chartex" xmlns:cx5="http://schemas.microsoft.com/office/drawing/2016/5/11/chartex" xmlns:cx6="http://schemas.microsoft.com/office/drawing/2016/5/12/chartex" xmlns:cx7="http://schemas.microsoft.com/office/drawing/2016/5/13/chartex" xmlns:cx8="http://schemas.microsoft.com/office/drawing/2016/5/14/chartex" xmlns:mc="http://schemas.openxmlformats.org/markup-compatibility/2006" xmlns:aink="http://schemas.microsoft.com/office/drawing/2016/ink" xmlns:am3d="http://schemas.microsoft.com/office/drawing/2017/model3d" xmlns:o="urn:schemas-microsoft-com:office:office" xmlns:oel="http://schemas.microsoft.com/office/2019/extlst" xmlns:r="http://schemas.openxmlformats.org/officeDocument/2006/relationships" xmlns:m="http://schemas.openxmlformats.org/officeDocument/2006/math" xmlns:v="urn:schemas-microsoft-com:vml" xmlns:wp14="http://schemas.microsoft.com/office/word/2010/wordprocessingDrawing" xmlns:wp="http://schemas.openxmlformats.org/drawingml/2006/wordprocessingDrawing" xmlns:w10="urn:schemas-microsoft-com:office:word" xmlns:w="http://schemas.openxmlformats.org/wordprocessingml/2006/main" xmlns:w14="http://schemas.microsoft.com/office/word/2010/wordml" xmlns:w15="http://schemas.microsoft.com/office/word/2012/wordml" xmlns:w16cex="http://schemas.microsoft.com/office/word/2018/wordml/cex" xmlns:w16cid="http://schemas.microsoft.com/office/word/2016/wordml/cid" xmlns:w16="http://schemas.microsoft.com/office/word/2018/wordml" xmlns:w16du="http://schemas.microsoft.com/office/word/2023/wordml/word16du" xmlns:w16sdtdh="http://schemas.microsoft.com/office/word/2020/wordml/sdtdatahash" xmlns:w16sdtfl="http://schemas.microsoft.com/office/word/2024/wordml/sdtformatlock" xmlns:w16se="http://schemas.microsoft.com/office/word/2015/wordml/symex" xmlns:wpg="http://schemas.microsoft.com/office/word/2010/wordprocessingGroup" xmlns:wpi="http://schemas.microsoft.com/office/word/2010/wordprocessingInk" xmlns:wne="http://schemas.microsoft.com/office/word/2006/wordml" xmlns:wps="http://schemas.microsoft.com/office/word/2010/wordprocessingShape" mc:Ignorable="w14 w15 w16se w16cid w16 w16cex w16sdtdh w16sdtfl w16du wp14">
   <w:p>
     <w:pPr>
       <w:pStyle w:val="Header"/>
@@ -1966,7 +2128,7 @@
 </file>
 
 <file path=word/header2.xml><?xml version="1.0" encoding="utf-8"?>
-<w:hdr xmlns:wpc="http://schemas.microsoft.com/office/word/2010/wordprocessingCanvas" xmlns:cx="http://schemas.microsoft.com/office/drawing/2014/chartex" xmlns:cx1="http://schemas.microsoft.com/office/drawing/2015/9/8/chartex" xmlns:cx2="http://schemas.microsoft.com/office/drawing/2015/10/21/chartex" xmlns:cx3="http://schemas.microsoft.com/office/drawing/2016/5/9/chartex" xmlns:cx4="http://schemas.microsoft.com/office/drawing/2016/5/10/chartex" xmlns:cx5="http://schemas.microsoft.com/office/drawing/2016/5/11/chartex" xmlns:cx6="http://schemas.microsoft.com/office/drawing/2016/5/12/chartex" xmlns:cx7="http://schemas.microsoft.com/office/drawing/2016/5/13/chartex" xmlns:cx8="http://schemas.microsoft.com/office/drawing/2016/5/14/chartex" xmlns:mc="http://schemas.openxmlformats.org/markup-compatibility/2006" xmlns:aink="http://schemas.microsoft.com/office/drawing/2016/ink" xmlns:am3d="http://schemas.microsoft.com/office/drawing/2017/model3d" xmlns:o="urn:schemas-microsoft-com:office:office" xmlns:oel="http://schemas.microsoft.com/office/2019/extlst" xmlns:r="http://schemas.openxmlformats.org/officeDocument/2006/relationships" xmlns:m="http://schemas.openxmlformats.org/officeDocument/2006/math" xmlns:v="urn:schemas-microsoft-com:vml" xmlns:wp14="http://schemas.microsoft.com/office/word/2010/wordprocessingDrawing" xmlns:wp="http://schemas.openxmlformats.org/drawingml/2006/wordprocessingDrawing" xmlns:w10="urn:schemas-microsoft-com:office:word" xmlns:w="http://schemas.openxmlformats.org/wordprocessingml/2006/main" xmlns:w14="http://schemas.microsoft.com/office/word/2010/wordml" xmlns:w15="http://schemas.microsoft.com/office/word/2012/wordml" xmlns:w16cei="http://schemas.microsoft.com/office/word/2026/wordml/cei" xmlns:w16cex="http://schemas.microsoft.com/office/word/2018/wordml/cex" xmlns:w16cid="http://schemas.microsoft.com/office/word/2016/wordml/cid" xmlns:w16="http://schemas.microsoft.com/office/word/2018/wordml" xmlns:w16du="http://schemas.microsoft.com/office/word/2023/wordml/word16du" xmlns:w16sdtdh="http://schemas.microsoft.com/office/word/2020/wordml/sdtdatahash" xmlns:w16sdtfl="http://schemas.microsoft.com/office/word/2024/wordml/sdtformatlock" xmlns:w16se="http://schemas.microsoft.com/office/word/2015/wordml/symex" xmlns:wpg="http://schemas.microsoft.com/office/word/2010/wordprocessingGroup" xmlns:wpi="http://schemas.microsoft.com/office/word/2010/wordprocessingInk" xmlns:wne="http://schemas.microsoft.com/office/word/2006/wordml" xmlns:wps="http://schemas.microsoft.com/office/word/2010/wordprocessingShape" mc:Ignorable="w14 w15 w16se w16cid w16 w16cex w16sdtdh w16sdtfl w16du wp14">
+<w:hdr xmlns:wpc="http://schemas.microsoft.com/office/word/2010/wordprocessingCanvas" xmlns:cx="http://schemas.microsoft.com/office/drawing/2014/chartex" xmlns:cx1="http://schemas.microsoft.com/office/drawing/2015/9/8/chartex" xmlns:cx2="http://schemas.microsoft.com/office/drawing/2015/10/21/chartex" xmlns:cx3="http://schemas.microsoft.com/office/drawing/2016/5/9/chartex" xmlns:cx4="http://schemas.microsoft.com/office/drawing/2016/5/10/chartex" xmlns:cx5="http://schemas.microsoft.com/office/drawing/2016/5/11/chartex" xmlns:cx6="http://schemas.microsoft.com/office/drawing/2016/5/12/chartex" xmlns:cx7="http://schemas.microsoft.com/office/drawing/2016/5/13/chartex" xmlns:cx8="http://schemas.microsoft.com/office/drawing/2016/5/14/chartex" xmlns:mc="http://schemas.openxmlformats.org/markup-compatibility/2006" xmlns:aink="http://schemas.microsoft.com/office/drawing/2016/ink" xmlns:am3d="http://schemas.microsoft.com/office/drawing/2017/model3d" xmlns:o="urn:schemas-microsoft-com:office:office" xmlns:oel="http://schemas.microsoft.com/office/2019/extlst" xmlns:r="http://schemas.openxmlformats.org/officeDocument/2006/relationships" xmlns:m="http://schemas.openxmlformats.org/officeDocument/2006/math" xmlns:v="urn:schemas-microsoft-com:vml" xmlns:wp14="http://schemas.microsoft.com/office/word/2010/wordprocessingDrawing" xmlns:wp="http://schemas.openxmlformats.org/drawingml/2006/wordprocessingDrawing" xmlns:w10="urn:schemas-microsoft-com:office:word" xmlns:w="http://schemas.openxmlformats.org/wordprocessingml/2006/main" xmlns:w14="http://schemas.microsoft.com/office/word/2010/wordml" xmlns:w15="http://schemas.microsoft.com/office/word/2012/wordml" xmlns:w16cex="http://schemas.microsoft.com/office/word/2018/wordml/cex" xmlns:w16cid="http://schemas.microsoft.com/office/word/2016/wordml/cid" xmlns:w16="http://schemas.microsoft.com/office/word/2018/wordml" xmlns:w16du="http://schemas.microsoft.com/office/word/2023/wordml/word16du" xmlns:w16sdtdh="http://schemas.microsoft.com/office/word/2020/wordml/sdtdatahash" xmlns:w16sdtfl="http://schemas.microsoft.com/office/word/2024/wordml/sdtformatlock" xmlns:w16se="http://schemas.microsoft.com/office/word/2015/wordml/symex" xmlns:wpg="http://schemas.microsoft.com/office/word/2010/wordprocessingGroup" xmlns:wpi="http://schemas.microsoft.com/office/word/2010/wordprocessingInk" xmlns:wne="http://schemas.microsoft.com/office/word/2006/wordml" xmlns:wps="http://schemas.microsoft.com/office/word/2010/wordprocessingShape" mc:Ignorable="w14 w15 w16se w16cid w16 w16cex w16sdtdh w16sdtfl w16du wp14">
   <w:p>
     <w:pPr>
       <w:pStyle w:val="Header"/>
@@ -2118,7 +2280,7 @@
             </wp:anchor>
           </w:drawing>
         </mc:Choice>
-        <mc:Fallback>
+        <mc:Fallback xmlns:w16cei="http://schemas.microsoft.com/office/word/2026/wordml/cei">
           <w:pict>
             <v:line w14:anchorId="56181A4C" id="Line 364" o:spid="_x0000_s1026" style="position:absolute;z-index:251648512;visibility:visible;mso-wrap-style:square;mso-width-percent:0;mso-height-percent:0;mso-wrap-distance-left:9pt;mso-wrap-distance-top:0;mso-wrap-distance-right:9pt;mso-wrap-distance-bottom:0;mso-position-horizontal:absolute;mso-position-horizontal-relative:margin;mso-position-vertical:absolute;mso-position-vertical-relative:text;mso-width-percent:0;mso-height-percent:0;mso-width-relative:page;mso-height-relative:page" from="-42.55pt,0" to="-42.5pt,737.1pt" o:gfxdata="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" o:allowincell="f" strokeweight="1.5pt">
               <w10:wrap anchorx="margin"/>
@@ -2205,7 +2367,7 @@
             </wp:anchor>
           </w:drawing>
         </mc:Choice>
-        <mc:Fallback>
+        <mc:Fallback xmlns:w16cei="http://schemas.microsoft.com/office/word/2026/wordml/cei">
           <w:pict>
             <v:line w14:anchorId="0CA1A22F" id="Line 366" o:spid="_x0000_s1026" style="position:absolute;flip:y;z-index:251650560;visibility:visible;mso-wrap-style:square;mso-width-percent:0;mso-height-percent:0;mso-wrap-distance-left:9pt;mso-wrap-distance-top:0;mso-wrap-distance-right:9pt;mso-wrap-distance-bottom:0;mso-position-horizontal:absolute;mso-position-horizontal-relative:text;mso-position-vertical:absolute;mso-position-vertical-relative:text;mso-width-percent:0;mso-height-percent:0;mso-width-relative:page;mso-height-relative:page" from="467.8pt,0" to="467.85pt,737.1pt" o:gfxdata="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" o:allowincell="f" strokeweight="1.5pt"/>
           </w:pict>
@@ -2290,7 +2452,7 @@
             </wp:anchor>
           </w:drawing>
         </mc:Choice>
-        <mc:Fallback>
+        <mc:Fallback xmlns:w16cei="http://schemas.microsoft.com/office/word/2026/wordml/cei">
           <w:pict>
             <v:line w14:anchorId="2E7150E5" id="Line 368" o:spid="_x0000_s1026" style="position:absolute;z-index:251652608;visibility:visible;mso-wrap-style:square;mso-width-percent:0;mso-height-percent:0;mso-wrap-distance-left:9pt;mso-wrap-distance-top:0;mso-wrap-distance-right:9pt;mso-wrap-distance-bottom:0;mso-position-horizontal:absolute;mso-position-horizontal-relative:text;mso-position-vertical:absolute;mso-position-vertical-relative:text;mso-width-percent:0;mso-height-percent:0;mso-width-relative:page;mso-height-relative:page" from="311.85pt,0" to="311.9pt,85.05pt" o:gfxdata="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" o:allowincell="f" strokeweight="1.5pt"/>
           </w:pict>
@@ -2375,7 +2537,7 @@
             </wp:anchor>
           </w:drawing>
         </mc:Choice>
-        <mc:Fallback>
+        <mc:Fallback xmlns:w16cei="http://schemas.microsoft.com/office/word/2026/wordml/cei">
           <w:pict>
             <v:line w14:anchorId="1B44F372" id="Line 365" o:spid="_x0000_s1026" style="position:absolute;z-index:251649536;visibility:visible;mso-wrap-style:square;mso-width-percent:0;mso-height-percent:0;mso-wrap-distance-left:9pt;mso-wrap-distance-top:0;mso-wrap-distance-right:9pt;mso-wrap-distance-bottom:0;mso-position-horizontal:absolute;mso-position-horizontal-relative:margin;mso-position-vertical:absolute;mso-position-vertical-relative:text;mso-width-percent:0;mso-height-percent:0;mso-width-relative:page;mso-height-relative:page" from="-42.55pt,0" to="467.75pt,.05pt" o:gfxdata="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" o:allowincell="f" strokeweight="1.5pt">
               <w10:wrap anchorx="margin"/>
@@ -2727,7 +2889,7 @@
             </wp:anchor>
           </w:drawing>
         </mc:Choice>
-        <mc:Fallback>
+        <mc:Fallback xmlns:w16cei="http://schemas.microsoft.com/office/word/2026/wordml/cei">
           <w:pict>
             <v:line w14:anchorId="51A3253D" id="Line 369" o:spid="_x0000_s1026" style="position:absolute;z-index:251653632;visibility:visible;mso-wrap-style:square;mso-width-percent:0;mso-height-percent:0;mso-wrap-distance-left:9pt;mso-wrap-distance-top:0;mso-wrap-distance-right:9pt;mso-wrap-distance-bottom:0;mso-position-horizontal:absolute;mso-position-horizontal-relative:margin;mso-position-vertical:absolute;mso-position-vertical-relative:page;mso-width-percent:0;mso-height-percent:0;mso-width-relative:page;mso-height-relative:page" from="311.85pt,70.9pt" to="467.8pt,70.95pt" o:gfxdata="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" o:allowincell="f" strokeweight="1.5pt">
               <w10:wrap anchorx="margin" anchory="page"/>
@@ -3423,7 +3585,7 @@
             </wp:anchor>
           </w:drawing>
         </mc:Choice>
-        <mc:Fallback>
+        <mc:Fallback xmlns:w16cei="http://schemas.microsoft.com/office/word/2026/wordml/cei">
           <w:pict>
             <v:line w14:anchorId="554191E2" id="Line 372" o:spid="_x0000_s1026" style="position:absolute;z-index:251656704;visibility:visible;mso-wrap-style:square;mso-width-percent:0;mso-height-percent:0;mso-wrap-distance-left:9pt;mso-wrap-distance-top:0;mso-wrap-distance-right:9pt;mso-wrap-distance-bottom:0;mso-position-horizontal:absolute;mso-position-horizontal-relative:margin;mso-position-vertical:absolute;mso-position-vertical-relative:page;mso-width-percent:0;mso-height-percent:0;mso-width-relative:page;mso-height-relative:page" from="311.85pt,91.85pt" to="467.8pt,91.9pt" o:gfxdata="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" o:allowincell="f" strokeweight="1.5pt">
               <w10:wrap anchorx="margin" anchory="page"/>
@@ -3751,7 +3913,7 @@
             </wp:anchor>
           </w:drawing>
         </mc:Choice>
-        <mc:Fallback>
+        <mc:Fallback xmlns:w16cei="http://schemas.microsoft.com/office/word/2026/wordml/cei">
           <w:pict>
             <v:line w14:anchorId="3D3AC759" id="Line 375" o:spid="_x0000_s1026" style="position:absolute;z-index:251658752;visibility:visible;mso-wrap-style:square;mso-width-percent:0;mso-height-percent:0;mso-wrap-distance-left:9pt;mso-wrap-distance-top:0;mso-wrap-distance-right:9pt;mso-wrap-distance-bottom:0;mso-position-horizontal:absolute;mso-position-horizontal-relative:margin;mso-position-vertical:absolute;mso-position-vertical-relative:page;mso-width-percent:0;mso-height-percent:0;mso-width-relative:page;mso-height-relative:page" from="311.85pt,112.1pt" to="467.8pt,112.15pt" o:gfxdata="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" o:allowincell="f" strokeweight="1.5pt">
               <w10:wrap anchorx="margin" anchory="page"/>
@@ -4351,7 +4513,7 @@
             </wp:anchor>
           </w:drawing>
         </mc:Choice>
-        <mc:Fallback>
+        <mc:Fallback xmlns:w16cei="http://schemas.microsoft.com/office/word/2026/wordml/cei">
           <w:pict>
             <v:line w14:anchorId="2F42C2AE" id="Line 374" o:spid="_x0000_s1026" style="position:absolute;flip:x;z-index:251657728;visibility:visible;mso-wrap-style:square;mso-width-percent:0;mso-height-percent:0;mso-wrap-distance-left:9pt;mso-wrap-distance-top:0;mso-wrap-distance-right:9pt;mso-wrap-distance-bottom:0;mso-position-horizontal:absolute;mso-position-horizontal-relative:margin;mso-position-vertical:absolute;mso-position-vertical-relative:text;mso-width-percent:0;mso-height-percent:0;mso-width-relative:page;mso-height-relative:page" from="-42.55pt,5.4pt" to="467.75pt,5.45pt" o:gfxdata="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" o:allowincell="f" strokeweight="1.5pt">
               <w10:wrap anchorx="margin"/>
@@ -4437,7 +4599,7 @@
             </wp:anchor>
           </w:drawing>
         </mc:Choice>
-        <mc:Fallback>
+        <mc:Fallback xmlns:w16cei="http://schemas.microsoft.com/office/word/2026/wordml/cei">
           <w:pict>
             <v:line w14:anchorId="4F289F9E" id="Line 367" o:spid="_x0000_s1026" style="position:absolute;flip:x;z-index:251651584;visibility:visible;mso-wrap-style:square;mso-width-percent:0;mso-height-percent:0;mso-wrap-distance-left:9pt;mso-wrap-distance-top:0;mso-wrap-distance-right:9pt;mso-wrap-distance-bottom:0;mso-position-horizontal:absolute;mso-position-horizontal-relative:margin;mso-position-vertical:absolute;mso-position-vertical-relative:text;mso-width-percent:0;mso-height-percent:0;mso-width-relative:page;mso-height-relative:page" from="-42.55pt,-15.6pt" to="467.75pt,-15.55pt" o:gfxdata="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" o:allowincell="f" strokeweight="1.5pt">
               <w10:wrap anchorx="margin"/>
@@ -4522,7 +4684,7 @@
             </wp:anchor>
           </w:drawing>
         </mc:Choice>
-        <mc:Fallback>
+        <mc:Fallback xmlns:w16cei="http://schemas.microsoft.com/office/word/2026/wordml/cei">
           <w:pict>
             <v:line w14:anchorId="6B9A0782" id="Line 370" o:spid="_x0000_s1026" style="position:absolute;flip:x;z-index:251654656;visibility:visible;mso-wrap-style:square;mso-width-percent:0;mso-height-percent:0;mso-wrap-distance-left:9pt;mso-wrap-distance-top:0;mso-wrap-distance-right:9pt;mso-wrap-distance-bottom:0;mso-position-horizontal:absolute;mso-position-horizontal-relative:text;mso-position-vertical:absolute;mso-position-vertical-relative:text;mso-width-percent:0;mso-height-percent:0;mso-width-relative:page;mso-height-relative:page" from="-42.55pt,636.45pt" to="467.75pt,636.5pt" o:gfxdata="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" o:allowincell="f" strokeweight="1.5pt"/>
           </w:pict>
@@ -4534,7 +4696,7 @@
 </file>
 
 <file path=word/header3.xml><?xml version="1.0" encoding="utf-8"?>
-<w:hdr xmlns:wpc="http://schemas.microsoft.com/office/word/2010/wordprocessingCanvas" xmlns:cx="http://schemas.microsoft.com/office/drawing/2014/chartex" xmlns:cx1="http://schemas.microsoft.com/office/drawing/2015/9/8/chartex" xmlns:cx2="http://schemas.microsoft.com/office/drawing/2015/10/21/chartex" xmlns:cx3="http://schemas.microsoft.com/office/drawing/2016/5/9/chartex" xmlns:cx4="http://schemas.microsoft.com/office/drawing/2016/5/10/chartex" xmlns:cx5="http://schemas.microsoft.com/office/drawing/2016/5/11/chartex" xmlns:cx6="http://schemas.microsoft.com/office/drawing/2016/5/12/chartex" xmlns:cx7="http://schemas.microsoft.com/office/drawing/2016/5/13/chartex" xmlns:cx8="http://schemas.microsoft.com/office/drawing/2016/5/14/chartex" xmlns:mc="http://schemas.openxmlformats.org/markup-compatibility/2006" xmlns:aink="http://schemas.microsoft.com/office/drawing/2016/ink" xmlns:am3d="http://schemas.microsoft.com/office/drawing/2017/model3d" xmlns:o="urn:schemas-microsoft-com:office:office" xmlns:oel="http://schemas.microsoft.com/office/2019/extlst" xmlns:r="http://schemas.openxmlformats.org/officeDocument/2006/relationships" xmlns:m="http://schemas.openxmlformats.org/officeDocument/2006/math" xmlns:v="urn:schemas-microsoft-com:vml" xmlns:wp14="http://schemas.microsoft.com/office/word/2010/wordprocessingDrawing" xmlns:wp="http://schemas.openxmlformats.org/drawingml/2006/wordprocessingDrawing" xmlns:w10="urn:schemas-microsoft-com:office:word" xmlns:w="http://schemas.openxmlformats.org/wordprocessingml/2006/main" xmlns:w14="http://schemas.microsoft.com/office/word/2010/wordml" xmlns:w15="http://schemas.microsoft.com/office/word/2012/wordml" xmlns:w16cei="http://schemas.microsoft.com/office/word/2026/wordml/cei" xmlns:w16cex="http://schemas.microsoft.com/office/word/2018/wordml/cex" xmlns:w16cid="http://schemas.microsoft.com/office/word/2016/wordml/cid" xmlns:w16="http://schemas.microsoft.com/office/word/2018/wordml" xmlns:w16du="http://schemas.microsoft.com/office/word/2023/wordml/word16du" xmlns:w16sdtdh="http://schemas.microsoft.com/office/word/2020/wordml/sdtdatahash" xmlns:w16sdtfl="http://schemas.microsoft.com/office/word/2024/wordml/sdtformatlock" xmlns:w16se="http://schemas.microsoft.com/office/word/2015/wordml/symex" xmlns:wpg="http://schemas.microsoft.com/office/word/2010/wordprocessingGroup" xmlns:wpi="http://schemas.microsoft.com/office/word/2010/wordprocessingInk" xmlns:wne="http://schemas.microsoft.com/office/word/2006/wordml" xmlns:wps="http://schemas.microsoft.com/office/word/2010/wordprocessingShape" mc:Ignorable="w14 w15 w16se w16cid w16 w16cex w16sdtdh w16sdtfl w16du wp14">
+<w:hdr xmlns:wpc="http://schemas.microsoft.com/office/word/2010/wordprocessingCanvas" xmlns:cx="http://schemas.microsoft.com/office/drawing/2014/chartex" xmlns:cx1="http://schemas.microsoft.com/office/drawing/2015/9/8/chartex" xmlns:cx2="http://schemas.microsoft.com/office/drawing/2015/10/21/chartex" xmlns:cx3="http://schemas.microsoft.com/office/drawing/2016/5/9/chartex" xmlns:cx4="http://schemas.microsoft.com/office/drawing/2016/5/10/chartex" xmlns:cx5="http://schemas.microsoft.com/office/drawing/2016/5/11/chartex" xmlns:cx6="http://schemas.microsoft.com/office/drawing/2016/5/12/chartex" xmlns:cx7="http://schemas.microsoft.com/office/drawing/2016/5/13/chartex" xmlns:cx8="http://schemas.microsoft.com/office/drawing/2016/5/14/chartex" xmlns:mc="http://schemas.openxmlformats.org/markup-compatibility/2006" xmlns:aink="http://schemas.microsoft.com/office/drawing/2016/ink" xmlns:am3d="http://schemas.microsoft.com/office/drawing/2017/model3d" xmlns:o="urn:schemas-microsoft-com:office:office" xmlns:oel="http://schemas.microsoft.com/office/2019/extlst" xmlns:r="http://schemas.openxmlformats.org/officeDocument/2006/relationships" xmlns:m="http://schemas.openxmlformats.org/officeDocument/2006/math" xmlns:v="urn:schemas-microsoft-com:vml" xmlns:wp14="http://schemas.microsoft.com/office/word/2010/wordprocessingDrawing" xmlns:wp="http://schemas.openxmlformats.org/drawingml/2006/wordprocessingDrawing" xmlns:w10="urn:schemas-microsoft-com:office:word" xmlns:w="http://schemas.openxmlformats.org/wordprocessingml/2006/main" xmlns:w14="http://schemas.microsoft.com/office/word/2010/wordml" xmlns:w15="http://schemas.microsoft.com/office/word/2012/wordml" xmlns:w16cex="http://schemas.microsoft.com/office/word/2018/wordml/cex" xmlns:w16cid="http://schemas.microsoft.com/office/word/2016/wordml/cid" xmlns:w16="http://schemas.microsoft.com/office/word/2018/wordml" xmlns:w16du="http://schemas.microsoft.com/office/word/2023/wordml/word16du" xmlns:w16sdtdh="http://schemas.microsoft.com/office/word/2020/wordml/sdtdatahash" xmlns:w16sdtfl="http://schemas.microsoft.com/office/word/2024/wordml/sdtformatlock" xmlns:w16se="http://schemas.microsoft.com/office/word/2015/wordml/symex" xmlns:wpg="http://schemas.microsoft.com/office/word/2010/wordprocessingGroup" xmlns:wpi="http://schemas.microsoft.com/office/word/2010/wordprocessingInk" xmlns:wne="http://schemas.microsoft.com/office/word/2006/wordml" xmlns:wps="http://schemas.microsoft.com/office/word/2010/wordprocessingShape" mc:Ignorable="w14 w15 w16se w16cid w16 w16cex w16sdtdh w16sdtfl w16du wp14">
   <w:p>
     <w:pPr>
       <w:pStyle w:val="Header"/>
@@ -4544,7 +4706,7 @@
 </file>
 
 <file path=word/numbering.xml><?xml version="1.0" encoding="utf-8"?>
-<w:numbering xmlns:wpc="http://schemas.microsoft.com/office/word/2010/wordprocessingCanvas" xmlns:cx="http://schemas.microsoft.com/office/drawing/2014/chartex" xmlns:cx1="http://schemas.microsoft.com/office/drawing/2015/9/8/chartex" xmlns:cx2="http://schemas.microsoft.com/office/drawing/2015/10/21/chartex" xmlns:cx3="http://schemas.microsoft.com/office/drawing/2016/5/9/chartex" xmlns:cx4="http://schemas.microsoft.com/office/drawing/2016/5/10/chartex" xmlns:cx5="http://schemas.microsoft.com/office/drawing/2016/5/11/chartex" xmlns:cx6="http://schemas.microsoft.com/office/drawing/2016/5/12/chartex" xmlns:cx7="http://schemas.microsoft.com/office/drawing/2016/5/13/chartex" xmlns:cx8="http://schemas.microsoft.com/office/drawing/2016/5/14/chartex" xmlns:mc="http://schemas.openxmlformats.org/markup-compatibility/2006" xmlns:aink="http://schemas.microsoft.com/office/drawing/2016/ink" xmlns:am3d="http://schemas.microsoft.com/office/drawing/2017/model3d" xmlns:o="urn:schemas-microsoft-com:office:office" xmlns:oel="http://schemas.microsoft.com/office/2019/extlst" xmlns:r="http://schemas.openxmlformats.org/officeDocument/2006/relationships" xmlns:m="http://schemas.openxmlformats.org/officeDocument/2006/math" xmlns:v="urn:schemas-microsoft-com:vml" xmlns:wp14="http://schemas.microsoft.com/office/word/2010/wordprocessingDrawing" xmlns:wp="http://schemas.openxmlformats.org/drawingml/2006/wordprocessingDrawing" xmlns:w10="urn:schemas-microsoft-com:office:word" xmlns:w="http://schemas.openxmlformats.org/wordprocessingml/2006/main" xmlns:w14="http://schemas.microsoft.com/office/word/2010/wordml" xmlns:w15="http://schemas.microsoft.com/office/word/2012/wordml" xmlns:w16cei="http://schemas.microsoft.com/office/word/2026/wordml/cei" xmlns:w16cex="http://schemas.microsoft.com/office/word/2018/wordml/cex" xmlns:w16cid="http://schemas.microsoft.com/office/word/2016/wordml/cid" xmlns:w16="http://schemas.microsoft.com/office/word/2018/wordml" xmlns:w16du="http://schemas.microsoft.com/office/word/2023/wordml/word16du" xmlns:w16sdtdh="http://schemas.microsoft.com/office/word/2020/wordml/sdtdatahash" xmlns:w16sdtfl="http://schemas.microsoft.com/office/word/2024/wordml/sdtformatlock" xmlns:w16se="http://schemas.microsoft.com/office/word/2015/wordml/symex" xmlns:wpg="http://schemas.microsoft.com/office/word/2010/wordprocessingGroup" xmlns:wpi="http://schemas.microsoft.com/office/word/2010/wordprocessingInk" xmlns:wne="http://schemas.microsoft.com/office/word/2006/wordml" xmlns:wps="http://schemas.microsoft.com/office/word/2010/wordprocessingShape" mc:Ignorable="w14 w15 w16se w16cid w16 w16cex w16sdtdh w16sdtfl w16du wp14">
+<w:numbering xmlns:wpc="http://schemas.microsoft.com/office/word/2010/wordprocessingCanvas" xmlns:cx="http://schemas.microsoft.com/office/drawing/2014/chartex" xmlns:cx1="http://schemas.microsoft.com/office/drawing/2015/9/8/chartex" xmlns:cx2="http://schemas.microsoft.com/office/drawing/2015/10/21/chartex" xmlns:cx3="http://schemas.microsoft.com/office/drawing/2016/5/9/chartex" xmlns:cx4="http://schemas.microsoft.com/office/drawing/2016/5/10/chartex" xmlns:cx5="http://schemas.microsoft.com/office/drawing/2016/5/11/chartex" xmlns:cx6="http://schemas.microsoft.com/office/drawing/2016/5/12/chartex" xmlns:cx7="http://schemas.microsoft.com/office/drawing/2016/5/13/chartex" xmlns:cx8="http://schemas.microsoft.com/office/drawing/2016/5/14/chartex" xmlns:mc="http://schemas.openxmlformats.org/markup-compatibility/2006" xmlns:aink="http://schemas.microsoft.com/office/drawing/2016/ink" xmlns:am3d="http://schemas.microsoft.com/office/drawing/2017/model3d" xmlns:o="urn:schemas-microsoft-com:office:office" xmlns:oel="http://schemas.microsoft.com/office/2019/extlst" xmlns:r="http://schemas.openxmlformats.org/officeDocument/2006/relationships" xmlns:m="http://schemas.openxmlformats.org/officeDocument/2006/math" xmlns:v="urn:schemas-microsoft-com:vml" xmlns:wp14="http://schemas.microsoft.com/office/word/2010/wordprocessingDrawing" xmlns:wp="http://schemas.openxmlformats.org/drawingml/2006/wordprocessingDrawing" xmlns:w10="urn:schemas-microsoft-com:office:word" xmlns:w="http://schemas.openxmlformats.org/wordprocessingml/2006/main" xmlns:w14="http://schemas.microsoft.com/office/word/2010/wordml" xmlns:w15="http://schemas.microsoft.com/office/word/2012/wordml" xmlns:w16cex="http://schemas.microsoft.com/office/word/2018/wordml/cex" xmlns:w16cid="http://schemas.microsoft.com/office/word/2016/wordml/cid" xmlns:w16="http://schemas.microsoft.com/office/word/2018/wordml" xmlns:w16du="http://schemas.microsoft.com/office/word/2023/wordml/word16du" xmlns:w16sdtdh="http://schemas.microsoft.com/office/word/2020/wordml/sdtdatahash" xmlns:w16sdtfl="http://schemas.microsoft.com/office/word/2024/wordml/sdtformatlock" xmlns:w16se="http://schemas.microsoft.com/office/word/2015/wordml/symex" xmlns:wpg="http://schemas.microsoft.com/office/word/2010/wordprocessingGroup" xmlns:wpi="http://schemas.microsoft.com/office/word/2010/wordprocessingInk" xmlns:wne="http://schemas.microsoft.com/office/word/2006/wordml" xmlns:wps="http://schemas.microsoft.com/office/word/2010/wordprocessingShape" mc:Ignorable="w14 w15 w16se w16cid w16 w16cex w16sdtdh w16sdtfl w16du wp14">
   <w:abstractNum w:abstractNumId="0" w15:restartNumberingAfterBreak="0">
     <w:nsid w:val="02837A80"/>
     <w:multiLevelType w:val="hybridMultilevel"/>
@@ -10747,7 +10909,6 @@
   <w:style w:type="character" w:default="1" w:styleId="DefaultParagraphFont">
     <w:name w:val="Default Paragraph Font"/>
     <w:uiPriority w:val="1"/>
-    <w:semiHidden/>
     <w:unhideWhenUsed/>
   </w:style>
   <w:style w:type="table" w:default="1" w:styleId="TableNormal">

</xml_diff>